<commit_message>
Fix network-direct printer readiness and refresh role guides
</commit_message>
<xml_diff>
--- a/DOCUMENTS/docs/MANUFACTURER_GUIDE.docx
+++ b/DOCUMENTS/docs/MANUFACTURER_GUIDE.docx
@@ -1064,7 +1064,7 @@
         <w:spacing w:after="60"/>
       </w:pPr>
       <w:r>
-        <w:t xml:space="preserve">5. Use Switch printer when you need another device.</w:t>
+        <w:t xml:space="preserve">5. Use Switch workstation printer when you need another device.</w:t>
       </w:r>
     </w:p>
     <w:p>
@@ -1102,15 +1102,23 @@
         <w:spacing w:after="60"/>
       </w:pPr>
       <w:r>
-        <w:t xml:space="preserve">2. Review the IP address, port, and command language.</w:t>
-      </w:r>
-    </w:p>
-    <w:p>
-      <w:pPr>
-        <w:spacing w:after="60"/>
-      </w:pPr>
-      <w:r>
-        <w:t xml:space="preserve">3. Open Printer Diagnostics if the registry status needs validation.</w:t>
+        <w:t xml:space="preserve">2. Review the IP address, TCP port, and supported command language:</w:t>
+      </w:r>
+    </w:p>
+    <w:p>
+      <w:pPr>
+        <w:spacing w:after="80"/>
+      </w:pPr>
+      <w:r>
+        <w:t xml:space="preserve">ZPL, TSPL, EPL, or CPCL.</w:t>
+      </w:r>
+    </w:p>
+    <w:p>
+      <w:pPr>
+        <w:spacing w:after="60"/>
+      </w:pPr>
+      <w:r>
+        <w:t xml:space="preserve">3. If the profile shows Needs validation, Offline, or Blocked, open Printer Diagnostics and correct the profile before printing.</w:t>
       </w:r>
     </w:p>
     <w:p>
@@ -1339,7 +1347,7 @@
         <w:spacing w:after="60"/>
       </w:pPr>
       <w:r>
-        <w:t xml:space="preserve">7. If the profile is Network-direct, review the network printer summary and validate it in diagnostics if needed.</w:t>
+        <w:t xml:space="preserve">7. If the profile is Network-direct, review the network printer summary and continue only when the registered profile status is READY.</w:t>
       </w:r>
     </w:p>
     <w:p>

</xml_diff>